<commit_message>
Implement direct active-snapshot 12M PD
</commit_message>
<xml_diff>
--- a/output/doc/credit_risk_selected_chapters_academic.docx
+++ b/output/doc/credit_risk_selected_chapters_academic.docx
@@ -1624,7 +1624,7 @@
     <w:p>
       <w:pPr/>
       <w:r>
-        <w:t>Expected loss is the bridge between borrower-level risk estimation and portfolio-level financial measurement. The updated framework now uses the original static HistGradientBoosting loan-level model for lifetime PD and a separate calendar-time hazard model for twelve-month PD.</w:t>
+        <w:t>Expected loss is the bridge between borrower-level risk estimation and portfolio-level financial measurement. The updated framework now uses the original static HistGradientBoosting loan-level model for lifetime PD and a direct active-snapshot XGBoost model for twelve-month PD.</w:t>
       </w:r>
     </w:p>
     <w:p>
@@ -1836,7 +1836,7 @@
               <w:rPr>
                 <w:sz w:val="14"/>
               </w:rPr>
-              <w:t>Calibrated calendar-time hazard model</w:t>
+              <w:t>Direct active-snapshot XGBoost model</w:t>
             </w:r>
           </w:p>
         </w:tc>
@@ -1860,7 +1860,7 @@
               <w:rPr>
                 <w:sz w:val="14"/>
               </w:rPr>
-              <w:t>Near-term expected-loss measurement on full observable 12-month cohorts</w:t>
+              <w:t>Near-term expected-loss measurement for active-at-snapshot cohorts</w:t>
             </w:r>
           </w:p>
         </w:tc>
@@ -2290,7 +2290,7 @@
     <w:p>
       <w:pPr/>
       <w:r>
-        <w:t>The auxiliary reserve hazard comparison remains useful for governance because it provides a time-consistent benchmark. It is no longer the source of lifetime PD: lifetime expected loss uses the rerun original static model, while twelve-month expected loss uses the calibrated calendar-time hazard model.</w:t>
+        <w:t>The auxiliary reserve hazard comparison remains useful for governance because it documents the intermediate monthly survival approach. It is no longer the main twelve-month PD input: lifetime expected loss uses the rerun original static model, while twelve-month expected loss uses the calibrated direct active-snapshot model.</w:t>
       </w:r>
     </w:p>
     <w:p>
@@ -2947,13 +2947,13 @@
     <w:p>
       <w:pPr/>
       <w:r>
-        <w:t>The twelve-month PD model produces short-horizon risk through calendar-time survival aggregation. Each row represents an account-month snapshot identified by sample_id and snapshot_month, and the target target_1m equals one when the account charges off or defaults in the following month. Splits are based on snapshot_month rather than issue_date, so the same account can legitimately contribute early observations to training and later observations to validation or test, matching how a bank would operate a monthly production risk file.</w:t>
+        <w:t>The main twelve-month PD model directly estimates whether an active-at-snapshot loan will charge off or default during the next twelve months. Each row represents an account-month snapshot identified by sample_id and snapshot_month, restricted to loans still at risk at that snapshot. Splits are based on snapshot_month rather than issue_date, so the design approximates a bank's recurring monthly production risk file.</w:t>
       </w:r>
     </w:p>
     <w:p>
       <w:pPr/>
       <w:r>
-        <w:t>Predicted monthly hazards are converted into cumulative twelve-month PDs by multiplying monthly survival probabilities. For numerical stability, the implementation sums log survival terms before converting back to cumulative PD. The lifetime PD is not produced from the calendar hazard curve in this version; it is supplied by the rerun static HGB loan-level model.</w:t>
+        <w:t>The earlier one-month hazard model is retained as a comparison group and research diagnostic. It converts monthly hazards into cumulative twelve-month PDs by summing log survival terms, but the final twelve-month EL input now comes from the direct active-snapshot XGBoost model because that target is aligned with the intended current-portfolio twelve-month decision horizon.</w:t>
       </w:r>
     </w:p>
     <w:p>
@@ -2962,7 +2962,7 @@
         <w:jc w:val="center"/>
       </w:pPr>
       <w:r>
-        <w:t>PD_12m = 1 - exp[sum log(1 - monthly hazard)], over the next twelve months;   PD_life = static HGB calibrated loan-level probability.</w:t>
+        <w:t>PD_12m = calibrated direct active-snapshot probability of default within the next twelve months;   PD_life = static HGB calibrated loan-level probability.</w:t>
       </w:r>
     </w:p>
     <w:p>
@@ -2970,7 +2970,7 @@
         <w:pStyle w:val="CaptionAcademic"/>
       </w:pPr>
       <w:r>
-        <w:t>Equation (5.1). Twelve-month hazard aggregation and static lifetime PD mapping.</w:t>
+        <w:t>Equation (5.1). Direct twelve-month PD and static lifetime PD mapping.</w:t>
       </w:r>
     </w:p>
     <w:p>
@@ -2993,7 +2993,7 @@
     <w:p>
       <w:pPr/>
       <w:r>
-        <w:t>The distinction between horizons is equally important. Twelve-month expected loss uses calibrated calendar-time hazard predicted_pd_12m, whereas lifetime expected loss uses the rerun original static HistGradientBoosting predicted_pd. This two-model design avoids forcing a single hazard specification to serve both short-horizon monitoring and lifetime reserve analytics.</w:t>
+        <w:t>The distinction between horizons is equally important. Twelve-month expected loss uses calibrated direct active-snapshot predicted_pd_12m, whereas lifetime expected loss uses the rerun original static HistGradientBoosting predicted_pd. This two-model design avoids forcing one specification to serve both short-horizon monitoring and lifetime reserve analytics.</w:t>
       </w:r>
     </w:p>
     <w:p>
@@ -3466,7 +3466,7 @@
               <w:rPr>
                 <w:sz w:val="14"/>
               </w:rPr>
-              <w:t>8.03</w:t>
+              <w:t>7.95</w:t>
             </w:r>
           </w:p>
         </w:tc>
@@ -3538,7 +3538,7 @@
               <w:rPr>
                 <w:sz w:val="14"/>
               </w:rPr>
-              <w:t>$504.2M</w:t>
+              <w:t>$499.5M</w:t>
             </w:r>
           </w:p>
         </w:tc>
@@ -3664,7 +3664,7 @@
               <w:rPr>
                 <w:sz w:val="14"/>
               </w:rPr>
-              <w:t>26.09</w:t>
+              <w:t>26.13</w:t>
             </w:r>
           </w:p>
         </w:tc>
@@ -3736,7 +3736,7 @@
               <w:rPr>
                 <w:sz w:val="14"/>
               </w:rPr>
-              <w:t>$839.0M</w:t>
+              <w:t>$840.6M</w:t>
             </w:r>
           </w:p>
         </w:tc>
@@ -3862,7 +3862,7 @@
               <w:rPr>
                 <w:sz w:val="14"/>
               </w:rPr>
-              <w:t>8.00</w:t>
+              <w:t>8.56</w:t>
             </w:r>
           </w:p>
         </w:tc>
@@ -3934,7 +3934,7 @@
               <w:rPr>
                 <w:sz w:val="14"/>
               </w:rPr>
-              <w:t>$732.7M</w:t>
+              <w:t>$777.3M</w:t>
             </w:r>
           </w:p>
         </w:tc>
@@ -4059,7 +4059,7 @@
               <w:rPr>
                 <w:sz w:val="14"/>
               </w:rPr>
-              <w:t>26.11</w:t>
+              <w:t>26.13</w:t>
             </w:r>
           </w:p>
         </w:tc>
@@ -4131,7 +4131,7 @@
               <w:rPr>
                 <w:sz w:val="14"/>
               </w:rPr>
-              <w:t>$2.452B</w:t>
+              <w:t>$2.456B</w:t>
             </w:r>
           </w:p>
         </w:tc>
@@ -4164,13 +4164,13 @@
     <w:p>
       <w:pPr/>
       <w:r>
-        <w:t>On the full observable twelve-month cohort, the model-implied expected loss equals $504.2M, whereas realized twelve-month net loss equals $350.4M. The conservative overlay therefore makes expected loss exceed realized loss by $153.7M, and the expected-loss coverage ratio is 143.87% of realized twelve-month loss. The resolved-only twelve-month comparison is retained as a diagnostic because that subset excludes surviving active loans and therefore overstates default intensity.</w:t>
+        <w:t>On the full observable twelve-month cohort, the model-implied expected loss equals $499.5M, whereas realized twelve-month net loss equals $350.4M. The conservative overlay therefore makes expected loss exceed realized loss by $149.1M, and the expected-loss coverage ratio is 142.53% of realized twelve-month loss. The resolved-only twelve-month comparison is retained as a diagnostic because that subset excludes surviving active loans and therefore overstates default intensity.</w:t>
       </w:r>
     </w:p>
     <w:p>
       <w:pPr/>
       <w:r>
-        <w:t>For the active snapshot, the reported twelve-month EL equals $732.7M, while the lifetime reserve-style EL equals $2.452B. The lifetime result is based on the static HGB model and is higher because its average lifetime PD (26.11%) exceeds the average twelve-month hazard PD (8.00%).</w:t>
+        <w:t>For the active snapshot, the reported twelve-month EL equals $777.3M, while the lifetime reserve-style EL equals $2.456B. The lifetime result is based on the static HGB model and is higher because its average lifetime PD (26.13%) exceeds the average direct twelve-month PD (8.56%).</w:t>
       </w:r>
     </w:p>
     <w:p>
@@ -4301,7 +4301,7 @@
     <w:p>
       <w:pPr/>
       <w:r>
-        <w:t>The evidence indicates that the full-cohort twelve-month comparison is materially less distorted than the resolved-only diagnostic. For lifetime, predicted EL equals $839.0M versus realized lifetime net loss of $616.3M, covering about 136.14% of realized loss.</w:t>
+        <w:t>The evidence indicates that the full-cohort twelve-month comparison is materially less distorted than the resolved-only diagnostic. For lifetime, predicted EL equals $840.6M versus realized lifetime net loss of $616.3M, covering about 136.39% of realized loss.</w:t>
       </w:r>
     </w:p>
     <w:p>
@@ -4657,7 +4657,7 @@
               <w:rPr>
                 <w:sz w:val="14"/>
               </w:rPr>
-              <w:t>$38.0M</w:t>
+              <w:t>$38.1M</w:t>
             </w:r>
           </w:p>
         </w:tc>
@@ -4681,7 +4681,7 @@
               <w:rPr>
                 <w:sz w:val="14"/>
               </w:rPr>
-              <w:t>4.53%</w:t>
+              <w:t>4.54%</w:t>
             </w:r>
           </w:p>
         </w:tc>
@@ -4705,7 +4705,7 @@
               <w:rPr>
                 <w:sz w:val="14"/>
               </w:rPr>
-              <w:t>$168.8M</w:t>
+              <w:t>$169.2M</w:t>
             </w:r>
           </w:p>
         </w:tc>
@@ -4783,7 +4783,7 @@
               <w:rPr>
                 <w:sz w:val="14"/>
               </w:rPr>
-              <w:t>$143.6M</w:t>
+              <w:t>$143.4M</w:t>
             </w:r>
           </w:p>
         </w:tc>
@@ -4807,7 +4807,7 @@
               <w:rPr>
                 <w:sz w:val="14"/>
               </w:rPr>
-              <w:t>17.11%</w:t>
+              <w:t>17.06%</w:t>
             </w:r>
           </w:p>
         </w:tc>
@@ -4831,7 +4831,7 @@
               <w:rPr>
                 <w:sz w:val="14"/>
               </w:rPr>
-              <w:t>$533.5M</w:t>
+              <w:t>$533.0M</w:t>
             </w:r>
           </w:p>
         </w:tc>
@@ -4855,7 +4855,7 @@
               <w:rPr>
                 <w:sz w:val="14"/>
               </w:rPr>
-              <w:t>21.76%</w:t>
+              <w:t>21.71%</w:t>
             </w:r>
           </w:p>
         </w:tc>
@@ -4909,7 +4909,7 @@
               <w:rPr>
                 <w:sz w:val="14"/>
               </w:rPr>
-              <w:t>$282.7M</w:t>
+              <w:t>$283.6M</w:t>
             </w:r>
           </w:p>
         </w:tc>
@@ -4933,7 +4933,7 @@
               <w:rPr>
                 <w:sz w:val="14"/>
               </w:rPr>
-              <w:t>33.70%</w:t>
+              <w:t>33.74%</w:t>
             </w:r>
           </w:p>
         </w:tc>
@@ -4957,7 +4957,7 @@
               <w:rPr>
                 <w:sz w:val="14"/>
               </w:rPr>
-              <w:t>$878.5M</w:t>
+              <w:t>$880.1M</w:t>
             </w:r>
           </w:p>
         </w:tc>
@@ -4981,7 +4981,7 @@
               <w:rPr>
                 <w:sz w:val="14"/>
               </w:rPr>
-              <w:t>35.83%</w:t>
+              <w:t>35.84%</w:t>
             </w:r>
           </w:p>
         </w:tc>
@@ -5035,7 +5035,7 @@
               <w:rPr>
                 <w:sz w:val="14"/>
               </w:rPr>
-              <w:t>$201.7M</w:t>
+              <w:t>$202.0M</w:t>
             </w:r>
           </w:p>
         </w:tc>
@@ -5059,7 +5059,7 @@
               <w:rPr>
                 <w:sz w:val="14"/>
               </w:rPr>
-              <w:t>24.04%</w:t>
+              <w:t>24.03%</w:t>
             </w:r>
           </w:p>
         </w:tc>
@@ -5083,7 +5083,7 @@
               <w:rPr>
                 <w:sz w:val="14"/>
               </w:rPr>
-              <w:t>$564.2M</w:t>
+              <w:t>$565.7M</w:t>
             </w:r>
           </w:p>
         </w:tc>
@@ -5107,7 +5107,7 @@
               <w:rPr>
                 <w:sz w:val="14"/>
               </w:rPr>
-              <w:t>23.01%</w:t>
+              <w:t>23.04%</w:t>
             </w:r>
           </w:p>
         </w:tc>
@@ -5161,7 +5161,7 @@
               <w:rPr>
                 <w:sz w:val="14"/>
               </w:rPr>
-              <w:t>$103.6M</w:t>
+              <w:t>$103.9M</w:t>
             </w:r>
           </w:p>
         </w:tc>
@@ -5185,7 +5185,7 @@
               <w:rPr>
                 <w:sz w:val="14"/>
               </w:rPr>
-              <w:t>12.35%</w:t>
+              <w:t>12.37%</w:t>
             </w:r>
           </w:p>
         </w:tc>
@@ -5209,7 +5209,7 @@
               <w:rPr>
                 <w:sz w:val="14"/>
               </w:rPr>
-              <w:t>$220.0M</w:t>
+              <w:t>$220.6M</w:t>
             </w:r>
           </w:p>
         </w:tc>
@@ -5233,7 +5233,7 @@
               <w:rPr>
                 <w:sz w:val="14"/>
               </w:rPr>
-              <w:t>8.97%</w:t>
+              <w:t>8.98%</w:t>
             </w:r>
           </w:p>
         </w:tc>
@@ -5287,7 +5287,7 @@
               <w:rPr>
                 <w:sz w:val="14"/>
               </w:rPr>
-              <w:t>$43.8M</w:t>
+              <w:t>$43.9M</w:t>
             </w:r>
           </w:p>
         </w:tc>
@@ -5335,7 +5335,7 @@
               <w:rPr>
                 <w:sz w:val="14"/>
               </w:rPr>
-              <w:t>$64.8M</w:t>
+              <w:t>$64.9M</w:t>
             </w:r>
           </w:p>
         </w:tc>
@@ -5413,7 +5413,7 @@
               <w:rPr>
                 <w:sz w:val="14"/>
               </w:rPr>
-              <w:t>$25.5M</w:t>
+              <w:t>$25.6M</w:t>
             </w:r>
           </w:p>
         </w:tc>
@@ -5437,7 +5437,7 @@
               <w:rPr>
                 <w:sz w:val="14"/>
               </w:rPr>
-              <w:t>3.05%</w:t>
+              <w:t>3.04%</w:t>
             </w:r>
           </w:p>
         </w:tc>
@@ -5485,7 +5485,7 @@
               <w:rPr>
                 <w:sz w:val="14"/>
               </w:rPr>
-              <w:t>0.90%</w:t>
+              <w:t>0.91%</w:t>
             </w:r>
           </w:p>
         </w:tc>
@@ -5729,7 +5729,7 @@
               <w:rPr>
                 <w:sz w:val="14"/>
               </w:rPr>
-              <w:t>33.70%</w:t>
+              <w:t>33.74%</w:t>
             </w:r>
           </w:p>
         </w:tc>
@@ -5777,7 +5777,7 @@
               <w:rPr>
                 <w:sz w:val="14"/>
               </w:rPr>
-              <w:t>35.83%</w:t>
+              <w:t>35.84%</w:t>
             </w:r>
           </w:p>
         </w:tc>
@@ -5855,7 +5855,7 @@
               <w:rPr>
                 <w:sz w:val="14"/>
               </w:rPr>
-              <w:t>50.87%</w:t>
+              <w:t>50.85%</w:t>
             </w:r>
           </w:p>
         </w:tc>
@@ -5903,7 +5903,7 @@
               <w:rPr>
                 <w:sz w:val="14"/>
               </w:rPr>
-              <w:t>66.81%</w:t>
+              <w:t>66.80%</w:t>
             </w:r>
           </w:p>
         </w:tc>
@@ -6107,7 +6107,7 @@
               <w:rPr>
                 <w:sz w:val="14"/>
               </w:rPr>
-              <w:t>62.92%</w:t>
+              <w:t>62.98%</w:t>
             </w:r>
           </w:p>
         </w:tc>
@@ -6155,7 +6155,7 @@
               <w:rPr>
                 <w:sz w:val="14"/>
               </w:rPr>
-              <w:t>58.94%</w:t>
+              <w:t>59.01%</w:t>
             </w:r>
           </w:p>
         </w:tc>
@@ -6233,7 +6233,7 @@
               <w:rPr>
                 <w:sz w:val="14"/>
               </w:rPr>
-              <w:t>51.45%</w:t>
+              <w:t>51.44%</w:t>
             </w:r>
           </w:p>
         </w:tc>
@@ -6281,7 +6281,7 @@
               <w:rPr>
                 <w:sz w:val="14"/>
               </w:rPr>
-              <w:t>50.40%</w:t>
+              <w:t>50.38%</w:t>
             </w:r>
           </w:p>
         </w:tc>
@@ -6303,13 +6303,13 @@
     <w:p>
       <w:pPr/>
       <w:r>
-        <w:t>Several concentration patterns are immediate. In the active snapshot, grade C alone contributes 35.83% of lifetime EL, followed by grade D at 23.01% and grade B at 21.76%. The resolved holdout exhibits a similar but slightly less concentrated pattern, with grade C contributing 33.70% and grade D contributing 24.04%.</w:t>
+        <w:t>Several concentration patterns are immediate. In the active snapshot, grade C alone contributes 35.84% of lifetime EL, followed by grade D at 23.04% and grade B at 21.71%. The resolved holdout exhibits a similar but slightly less concentrated pattern, with grade C contributing 33.74% and grade D contributing 24.03%.</w:t>
       </w:r>
     </w:p>
     <w:p>
       <w:pPr/>
       <w:r>
-        <w:t>The cross-axis concentration statistics reinforce the same story. Debt Consolidation loans account for 62.10% of resolved lifetime EL, while Debt Consolidation loans account for 61.69% of active lifetime EL. The leading term segment is 60 months in the resolved holdout (50.87%) and 60 months in the active snapshot (66.81%), indicating that contractual tenor remains a primary driver of reserve exposure.</w:t>
+        <w:t>The cross-axis concentration statistics reinforce the same story. Debt Consolidation loans account for 62.10% of resolved lifetime EL, while Debt Consolidation loans account for 61.69% of active lifetime EL. The leading term segment is 60 months in the resolved holdout (50.85%) and 60 months in the active snapshot (66.80%), indicating that contractual tenor remains a primary driver of reserve exposure.</w:t>
       </w:r>
     </w:p>
     <w:p>

</xml_diff>

<commit_message>
Remove stale hazard references from paper
</commit_message>
<xml_diff>
--- a/output/doc/credit_risk_selected_chapters_academic.docx
+++ b/output/doc/credit_risk_selected_chapters_academic.docx
@@ -2290,7 +2290,7 @@
     <w:p>
       <w:pPr/>
       <w:r>
-        <w:t>The auxiliary reserve hazard comparison remains useful for governance because it documents the intermediate monthly survival approach. It is no longer the main twelve-month PD input: lifetime expected loss uses the rerun original static model, while twelve-month expected loss uses the calibrated direct active-snapshot model.</w:t>
+        <w:t>The calendar-time hazard comparison remains useful for governance because it documents the intermediate monthly survival approach. It is no longer the main twelve-month PD input: lifetime expected loss uses the rerun original static model, while twelve-month expected loss uses the calibrated direct active-snapshot model.</w:t>
       </w:r>
     </w:p>
     <w:p>
@@ -2303,7 +2303,7 @@
         <w:pStyle w:val="CaptionAcademic"/>
       </w:pPr>
       <w:r>
-        <w:t>Table 5.2. Auxiliary legacy reserve hazard benchmark, not used as the main PD input.</w:t>
+        <w:t>Table 5.2. Direct twelve-month champion versus calendar-time hazard diagnostic on the full observable twelve-month cohort.</w:t>
       </w:r>
     </w:p>
     <w:tbl>
@@ -2343,7 +2343,6 @@
           </w:tcPr>
           <w:p>
             <w:pPr>
-              <w:pStyle w:val="TableBodyAcademic"/>
               <w:spacing w:before="0" w:after="0" w:line="240" w:lineRule="auto"/>
               <w:jc w:val="left"/>
             </w:pPr>
@@ -2352,7 +2351,7 @@
                 <w:b/>
                 <w:sz w:val="13"/>
               </w:rPr>
-              <w:t>Hazard model</w:t>
+              <w:t>12M PD model</w:t>
             </w:r>
           </w:p>
         </w:tc>
@@ -2370,7 +2369,6 @@
           </w:tcPr>
           <w:p>
             <w:pPr>
-              <w:pStyle w:val="TableBodyAcademic"/>
               <w:spacing w:before="0" w:after="0" w:line="240" w:lineRule="auto"/>
               <w:jc w:val="left"/>
             </w:pPr>
@@ -2379,7 +2377,7 @@
                 <w:b/>
                 <w:sz w:val="13"/>
               </w:rPr>
-              <w:t>Selected</w:t>
+              <w:t>Role</w:t>
             </w:r>
           </w:p>
         </w:tc>
@@ -2397,7 +2395,6 @@
           </w:tcPr>
           <w:p>
             <w:pPr>
-              <w:pStyle w:val="TableBodyAcademic"/>
               <w:spacing w:before="0" w:after="0" w:line="240" w:lineRule="auto"/>
               <w:jc w:val="left"/>
             </w:pPr>
@@ -2406,7 +2403,7 @@
                 <w:b/>
                 <w:sz w:val="13"/>
               </w:rPr>
-              <w:t>Validation lifetime AUC</w:t>
+              <w:t>Main EL</w:t>
             </w:r>
           </w:p>
         </w:tc>
@@ -2424,7 +2421,6 @@
           </w:tcPr>
           <w:p>
             <w:pPr>
-              <w:pStyle w:val="TableBodyAcademic"/>
               <w:spacing w:before="0" w:after="0" w:line="240" w:lineRule="auto"/>
               <w:jc w:val="left"/>
             </w:pPr>
@@ -2433,7 +2429,7 @@
                 <w:b/>
                 <w:sz w:val="13"/>
               </w:rPr>
-              <w:t>Validation lifetime KS</w:t>
+              <w:t>AUC</w:t>
             </w:r>
           </w:p>
         </w:tc>
@@ -2451,7 +2447,6 @@
           </w:tcPr>
           <w:p>
             <w:pPr>
-              <w:pStyle w:val="TableBodyAcademic"/>
               <w:spacing w:before="0" w:after="0" w:line="240" w:lineRule="auto"/>
               <w:jc w:val="left"/>
             </w:pPr>
@@ -2460,7 +2455,7 @@
                 <w:b/>
                 <w:sz w:val="13"/>
               </w:rPr>
-              <w:t>Validation lifetime Brier</w:t>
+              <w:t>KS</w:t>
             </w:r>
           </w:p>
         </w:tc>
@@ -2478,7 +2473,6 @@
           </w:tcPr>
           <w:p>
             <w:pPr>
-              <w:pStyle w:val="TableBodyAcademic"/>
               <w:spacing w:before="0" w:after="0" w:line="240" w:lineRule="auto"/>
               <w:jc w:val="left"/>
             </w:pPr>
@@ -2487,7 +2481,7 @@
                 <w:b/>
                 <w:sz w:val="13"/>
               </w:rPr>
-              <w:t>Test lifetime AUC</w:t>
+              <w:t>Brier</w:t>
             </w:r>
           </w:p>
         </w:tc>
@@ -2505,7 +2499,6 @@
           </w:tcPr>
           <w:p>
             <w:pPr>
-              <w:pStyle w:val="TableBodyAcademic"/>
               <w:spacing w:before="0" w:after="0" w:line="240" w:lineRule="auto"/>
               <w:jc w:val="left"/>
             </w:pPr>
@@ -2514,7 +2507,7 @@
                 <w:b/>
                 <w:sz w:val="13"/>
               </w:rPr>
-              <w:t>Test lifetime KS</w:t>
+              <w:t>Avg PD</w:t>
             </w:r>
           </w:p>
         </w:tc>
@@ -2532,7 +2525,6 @@
           </w:tcPr>
           <w:p>
             <w:pPr>
-              <w:pStyle w:val="TableBodyAcademic"/>
               <w:spacing w:before="0" w:after="0" w:line="240" w:lineRule="auto"/>
               <w:jc w:val="left"/>
             </w:pPr>
@@ -2541,7 +2533,7 @@
                 <w:b/>
                 <w:sz w:val="13"/>
               </w:rPr>
-              <w:t>Test lifetime Brier</w:t>
+              <w:t>EL coverage</w:t>
             </w:r>
           </w:p>
         </w:tc>
@@ -2571,7 +2563,7 @@
               <w:rPr>
                 <w:sz w:val="13"/>
               </w:rPr>
-              <w:t>HistGradientBoosting Hazard</w:t>
+              <w:t>Direct active-snapshot XGBoost</w:t>
             </w:r>
           </w:p>
         </w:tc>
@@ -2595,7 +2587,7 @@
               <w:rPr>
                 <w:sz w:val="13"/>
               </w:rPr>
-              <w:t>True</w:t>
+              <w:t>Champion</w:t>
             </w:r>
           </w:p>
         </w:tc>
@@ -2619,7 +2611,7 @@
               <w:rPr>
                 <w:sz w:val="13"/>
               </w:rPr>
-              <w:t>0.6944</w:t>
+              <w:t>Yes</w:t>
             </w:r>
           </w:p>
         </w:tc>
@@ -2643,7 +2635,7 @@
               <w:rPr>
                 <w:sz w:val="13"/>
               </w:rPr>
-              <w:t>0.2800</w:t>
+              <w:t>0.6672</w:t>
             </w:r>
           </w:p>
         </w:tc>
@@ -2667,7 +2659,7 @@
               <w:rPr>
                 <w:sz w:val="13"/>
               </w:rPr>
-              <w:t>0.1629</w:t>
+              <w:t>0.2380</w:t>
             </w:r>
           </w:p>
         </w:tc>
@@ -2691,7 +2683,7 @@
               <w:rPr>
                 <w:sz w:val="13"/>
               </w:rPr>
-              <w:t>0.6833</w:t>
+              <w:t>0.0565</w:t>
             </w:r>
           </w:p>
         </w:tc>
@@ -2715,7 +2707,7 @@
               <w:rPr>
                 <w:sz w:val="13"/>
               </w:rPr>
-              <w:t>0.2706</w:t>
+              <w:t>7.95%</w:t>
             </w:r>
           </w:p>
         </w:tc>
@@ -2739,7 +2731,7 @@
               <w:rPr>
                 <w:sz w:val="13"/>
               </w:rPr>
-              <w:t>0.1551</w:t>
+              <w:t>142.53%</w:t>
             </w:r>
           </w:p>
         </w:tc>
@@ -2769,7 +2761,7 @@
               <w:rPr>
                 <w:sz w:val="13"/>
               </w:rPr>
-              <w:t>Pooled Logistic Hazard</w:t>
+              <w:t>Calendar-time hazard diagnostic</w:t>
             </w:r>
           </w:p>
         </w:tc>
@@ -2793,7 +2785,7 @@
               <w:rPr>
                 <w:sz w:val="13"/>
               </w:rPr>
-              <w:t>False</w:t>
+              <w:t>Comparison</w:t>
             </w:r>
           </w:p>
         </w:tc>
@@ -2817,7 +2809,7 @@
               <w:rPr>
                 <w:sz w:val="13"/>
               </w:rPr>
-              <w:t>0.6943</w:t>
+              <w:t>No</w:t>
             </w:r>
           </w:p>
         </w:tc>
@@ -2841,7 +2833,7 @@
               <w:rPr>
                 <w:sz w:val="13"/>
               </w:rPr>
-              <w:t>0.2797</w:t>
+              <w:t>0.5852</w:t>
             </w:r>
           </w:p>
         </w:tc>
@@ -2865,7 +2857,7 @@
               <w:rPr>
                 <w:sz w:val="13"/>
               </w:rPr>
-              <w:t>0.1628</w:t>
+              <w:t>0.1176</w:t>
             </w:r>
           </w:p>
         </w:tc>
@@ -2889,7 +2881,7 @@
               <w:rPr>
                 <w:sz w:val="13"/>
               </w:rPr>
-              <w:t>0.6830</w:t>
+              <w:t>0.0598</w:t>
             </w:r>
           </w:p>
         </w:tc>
@@ -2913,7 +2905,7 @@
               <w:rPr>
                 <w:sz w:val="13"/>
               </w:rPr>
-              <w:t>0.2685</w:t>
+              <w:t>1.32%</w:t>
             </w:r>
           </w:p>
         </w:tc>
@@ -2937,7 +2929,7 @@
               <w:rPr>
                 <w:sz w:val="13"/>
               </w:rPr>
-              <w:t>0.1554</w:t>
+              <w:t>22.22%</w:t>
             </w:r>
           </w:p>
         </w:tc>
@@ -3063,8 +3055,9 @@
       </w:r>
     </w:p>
     <w:p>
+      <w:pPr/>
       <w:r>
-        <w:t>Portfolio expected loss is obtained by summing loan-level expected loss across the relevant scope. The resulting summary table highlights two separate use cases. For the resolved holdout, predicted twelve-month EL can be benchmarked against realized net loss because both are referenced to the same origination vintages and the same funded-exposure base. For the active snapshot, the output is better interpreted as a reserve-style measure of dollar risk embedded in the currently outstanding loan book.</w:t>
+        <w:t>Portfolio expected loss is obtained by summing loan-level expected loss across the relevant scope. The resulting summary table highlights two separate use cases. The full observable twelve-month cohort is the primary backtest because it includes loans that default and loans that survive through a complete twelve-month observation window. The resolved-only twelve-month view is retained only as a selection-biased diagnostic, while the active snapshot is interpreted as a reserve-style measure of dollar risk embedded in the currently outstanding loan book.</w:t>
       </w:r>
     </w:p>
     <w:p>

</xml_diff>